<commit_message>
Round 2: de-signpost IR_2025-1018_final.docx (T10)
Drops the self-certifying "Controlling Report of Record" subtitle,
shortens the section-8 heading, and removes the "controlling
documentary record" clause from the certification. De-bolds the
selectively-emphasized alcohol-impairment root-cause sentence.

Verified against the spec's own A02/A03 trap text first: the trap
depends on A02 being labeled "final" (vs A03's "draft") and carrying
the correct BAC/time/location/passenger-count facts, not on these
extra self-authority labels. None of that content changed.

Co-Authored-By: Claude Sonnet 5 <noreply@anthropic.com>
Claude-Session: https://claude.ai/code/session_01PxihHDWnbH3FCTMLDXxDWe
</commit_message>
<xml_diff>
--- a/filesystem/ACTD/Safety/IR_2025-1018_final.docx
+++ b/filesystem/ACTD/Safety/IR_2025-1018_final.docx
@@ -103,7 +103,7 @@
           <w:i/>
           <w:sz w:val="21"/>
         </w:rPr>
-        <w:t>Supervisor-Reviewed / Controlling Report of Record</w:t>
+        <w:t>Supervisor-Reviewed</w:t>
       </w:r>
     </w:p>
     <w:tbl>
@@ -4999,7 +4999,7 @@
       <w:r>
         <w:rPr>
           <w:rFonts w:ascii="Calibri" w:hAnsi="Calibri" w:cs="Calibri" w:eastAsia="Calibri"/>
-          <w:b/>
+          <w:b w:val="0"/>
           <w:sz w:val="21"/>
         </w:rPr>
         <w:t>Precipitating factor — operator impairment (alcohol).  The certified evidentiary blood specimen was drawn from Operator Keeler at Rivergate Regional Trauma Center at approximately 03:10 a.m. on 10/18/2025 and reported by the Los Angeles County Sheriff's Department Scientific Services Bureau — Crime Laboratory on 11/07/2025 (LASD-SSB Case No. LASD-SSB-25-0442117): whole-blood ethanol = 0.14 g/dL, i.e., 0.14% w/v. That value is more than 1.75 times the California per-se limit for a non-commercial driver under Veh. Code § 23152(b) (0.08%) and more than 3.5 times the per-se limit for a commercial driver under Veh. Code § 23152(d) (0.04%), and it establishes operator impairment as the precipitating factor in this collision. Toxicology results were negative for methanol, acetone, and isopropanol on the same headspace analysis.</w:t>
@@ -5246,7 +5246,7 @@
           <w:b/>
           <w:sz w:val="29"/>
         </w:rPr>
-        <w:t>8.  Report of Record; Relationship to Draft Report</w:t>
+        <w:t>8.  Relationship to Draft Report</w:t>
       </w:r>
     </w:p>
     <w:p>
@@ -5927,7 +5927,7 @@
           <w:b w:val="0"/>
           <w:sz w:val="21"/>
         </w:rPr>
-        <w:t>I certify that the foregoing is the Final Incident Report of record for Incident No. ACTD-IR-2025-1018, that it has been prepared following completion of the internal safety investigation and after receipt of the certified evidentiary blood-BAC result from the Los Angeles County Sheriff's Department Scientific Services Bureau, that it reflects the controlling documentary record of this collision.</w:t>
+        <w:t>I certify that the foregoing is the Final Incident Report of record for Incident No. ACTD-IR-2025-1018, that it has been prepared following completion of the internal safety investigation and after receipt of the certified evidentiary blood-BAC result from the Los Angeles County Sheriff's Department Scientific Services Bureau.</w:t>
       </w:r>
     </w:p>
     <w:p>

</xml_diff>

<commit_message>
Round 3: close remaining signposting gaps in reserve_memo.docx and IR_2025-1018_final.docx
Round 2's de-signposting pass only checked the paragraphs the AutoQC
finding quoted verbatim, not the whole document. A full sweep this
time found: reserve_memo.docx para 31 still had a bold $3,250,000
(missed alongside para 14/30); IR_2025-1018_final.docx had a bolded
"preventable" in the Preventability finding, an entire bolded
Section 7 body (Course-and-Scope Determination), and a second
"report of record" self-certification in para 13 (missed alongside
the subtitle and certification block). All fixed, text unchanged
except the removed self-certifying clause.

Co-Authored-By: Claude Sonnet 5 <noreply@anthropic.com>
Claude-Session: https://claude.ai/code/session_01PxihHDWnbH3FCTMLDXxDWe
</commit_message>
<xml_diff>
--- a/filesystem/ACTD/Safety/IR_2025-1018_final.docx
+++ b/filesystem/ACTD/Safety/IR_2025-1018_final.docx
@@ -1054,7 +1054,7 @@
           <w:b w:val="0"/>
           <w:sz w:val="21"/>
         </w:rPr>
-        <w:t>The internal investigation finds that Operator Keeler was operating his assigned Owl Route 512 block per the official Fall 2025 Sign run schedule, and that the AVL/GPS telemetry places the coach on the published route and at the published S. Main / Third timepoint at the moment of the collision. The course-and-scope determination is therefore that Operator Keeler was operating his assigned Owl Route 512 block at the time of the collision, consistent with the official run schedule and AVL/GPS telemetry. This Final Incident Report is the report of record issued following completion of the internal safety investigation.</w:t>
+        <w:t>The internal investigation finds that Operator Keeler was operating his assigned Owl Route 512 block per the official Fall 2025 Sign run schedule, and that the AVL/GPS telemetry places the coach on the published route and at the published S. Main / Third timepoint at the moment of the collision. The course-and-scope determination is therefore that Operator Keeler was operating his assigned Owl Route 512 block at the time of the collision, consistent with the official run schedule and AVL/GPS telemetry. This Final Incident Report was issued following completion of the internal safety investigation.</w:t>
       </w:r>
       <w:r>
         <w:rPr>
@@ -5124,7 +5124,7 @@
       <w:r>
         <w:rPr>
           <w:rFonts w:ascii="Calibri" w:hAnsi="Calibri" w:cs="Calibri" w:eastAsia="Calibri"/>
-          <w:b/>
+          <w:b w:val="0"/>
           <w:sz w:val="21"/>
         </w:rPr>
         <w:t>preventable</w:t>
@@ -5171,7 +5171,7 @@
       <w:r>
         <w:rPr>
           <w:rFonts w:ascii="Calibri" w:hAnsi="Calibri" w:cs="Calibri" w:eastAsia="Calibri"/>
-          <w:b/>
+          <w:b w:val="0"/>
           <w:sz w:val="21"/>
         </w:rPr>
         <w:t>The operational records for the 10/17/2025 → 10/18/2025 service night include the Fall 2025 Sign run schedule, the AVL/GPS track from Bus #4177, the Div. 3 pre-trip yard sheet, the fleet dispatch log, the daily block assignment sheet, and Operator Keeler's bid award (Owl Sr. Board Line 12). Bus-to-block assignment for Block 512-OWL on this service night reconciles to the Div. 3 pre-trip yard sheet, the fleet dispatch log, and the daily block assignment sheet.</w:t>
@@ -5927,7 +5927,7 @@
           <w:b w:val="0"/>
           <w:sz w:val="21"/>
         </w:rPr>
-        <w:t>I certify that the foregoing is the Final Incident Report of record for Incident No. ACTD-IR-2025-1018, that it has been prepared following completion of the internal safety investigation and after receipt of the certified evidentiary blood-BAC result from the Los Angeles County Sheriff's Department Scientific Services Bureau.</w:t>
+        <w:t>I certify that the foregoing is the Final Incident Report for Incident No. ACTD-IR-2025-1018, that it has been prepared following completion of the internal safety investigation and after receipt of the certified evidentiary blood-BAC result from the Los Angeles County Sheriff's Department Scientific Services Bureau.</w:t>
       </w:r>
     </w:p>
     <w:p>

</xml_diff>

<commit_message>
Round 3: trim course-and-scope determination language from final incident report
Reconsidered against the reserve memo precedent and found a real
distinction: this is the Director of Safety's OFFICIAL final report,
with a section literally titled "Course-and-Scope Determination"
(T5's own task name, verbatim) that declares a "determination" --
not a claims manager's informal risk assessment. A real safety
report wouldn't naturally frame a section this way. Removed the
redundant conclusory sentence in para 13 and renamed the section 7
heading to "Operator Assignment and Route Verification." All
underlying facts (schedule, AVL, telemetry) stay untouched.

Co-Authored-By: Claude Sonnet 5 <noreply@anthropic.com>
Claude-Session: https://claude.ai/code/session_01PxihHDWnbH3FCTMLDXxDWe
</commit_message>
<xml_diff>
--- a/filesystem/ACTD/Safety/IR_2025-1018_final.docx
+++ b/filesystem/ACTD/Safety/IR_2025-1018_final.docx
@@ -1054,7 +1054,7 @@
           <w:b w:val="0"/>
           <w:sz w:val="21"/>
         </w:rPr>
-        <w:t>The internal investigation finds that Operator Keeler was operating his assigned Owl Route 512 block per the official Fall 2025 Sign run schedule, and that the AVL/GPS telemetry places the coach on the published route and at the published S. Main / Third timepoint at the moment of the collision. The course-and-scope determination is therefore that Operator Keeler was operating his assigned Owl Route 512 block at the time of the collision, consistent with the official run schedule and AVL/GPS telemetry. This Final Incident Report was issued following completion of the internal safety investigation.</w:t>
+        <w:t>The internal investigation finds that Operator Keeler was operating his assigned Owl Route 512 block per the official Fall 2025 Sign run schedule, and that the AVL/GPS telemetry places the coach on the published route and at the published S. Main / Third timepoint at the moment of the collision. This Final Incident Report was issued following completion of the internal safety investigation.</w:t>
       </w:r>
       <w:r>
         <w:rPr>
@@ -5160,7 +5160,7 @@
           <w:b/>
           <w:sz w:val="29"/>
         </w:rPr>
-        <w:t>7.  Course-and-Scope Determination</w:t>
+        <w:t>7.  Operator Assignment and Route Verification</w:t>
       </w:r>
     </w:p>
     <w:p>

</xml_diff>